<commit_message>
GitHub CI/CD note added
</commit_message>
<xml_diff>
--- a/Portfolio Project Write-up.docx
+++ b/Portfolio Project Write-up.docx
@@ -1,6 +1,6 @@
 
 <file path=word/document.xml><?xml version="1.0" encoding="utf-8"?>
-<w:document xmlns:wpc="http://schemas.microsoft.com/office/word/2010/wordprocessingCanvas" xmlns:cx="http://schemas.microsoft.com/office/drawing/2014/chartex" xmlns:cx1="http://schemas.microsoft.com/office/drawing/2015/9/8/chartex" xmlns:cx2="http://schemas.microsoft.com/office/drawing/2015/10/21/chartex" xmlns:cx3="http://schemas.microsoft.com/office/drawing/2016/5/9/chartex" xmlns:cx4="http://schemas.microsoft.com/office/drawing/2016/5/10/chartex" xmlns:cx5="http://schemas.microsoft.com/office/drawing/2016/5/11/chartex" xmlns:cx6="http://schemas.microsoft.com/office/drawing/2016/5/12/chartex" xmlns:cx7="http://schemas.microsoft.com/office/drawing/2016/5/13/chartex" xmlns:cx8="http://schemas.microsoft.com/office/drawing/2016/5/14/chartex" xmlns:mc="http://schemas.openxmlformats.org/markup-compatibility/2006" xmlns:aink="http://schemas.microsoft.com/office/drawing/2016/ink" xmlns:am3d="http://schemas.microsoft.com/office/drawing/2017/model3d" xmlns:o="urn:schemas-microsoft-com:office:office" xmlns:oel="http://schemas.microsoft.com/office/2019/extlst" xmlns:r="http://schemas.openxmlformats.org/officeDocument/2006/relationships" xmlns:m="http://schemas.openxmlformats.org/officeDocument/2006/math" xmlns:v="urn:schemas-microsoft-com:vml" xmlns:wp14="http://schemas.microsoft.com/office/word/2010/wordprocessingDrawing" xmlns:wp="http://schemas.openxmlformats.org/drawingml/2006/wordprocessingDrawing" xmlns:w10="urn:schemas-microsoft-com:office:word" xmlns:w="http://schemas.openxmlformats.org/wordprocessingml/2006/main" xmlns:w14="http://schemas.microsoft.com/office/word/2010/wordml" xmlns:w15="http://schemas.microsoft.com/office/word/2012/wordml" xmlns:w16cex="http://schemas.microsoft.com/office/word/2018/wordml/cex" xmlns:w16cid="http://schemas.microsoft.com/office/word/2016/wordml/cid" xmlns:w16="http://schemas.microsoft.com/office/word/2018/wordml" xmlns:w16du="http://schemas.microsoft.com/office/word/2023/wordml/word16du" xmlns:w16sdtdh="http://schemas.microsoft.com/office/word/2020/wordml/sdtdatahash" xmlns:w16sdtfl="http://schemas.microsoft.com/office/word/2024/wordml/sdtformatlock" xmlns:w16se="http://schemas.microsoft.com/office/word/2015/wordml/symex" xmlns:wpg="http://schemas.microsoft.com/office/word/2010/wordprocessingGroup" xmlns:wpi="http://schemas.microsoft.com/office/word/2010/wordprocessingInk" xmlns:wne="http://schemas.microsoft.com/office/word/2006/wordml" xmlns:wps="http://schemas.microsoft.com/office/word/2010/wordprocessingShape" mc:Ignorable="w14 w15 w16se w16cid w16 w16cex w16sdtdh w16sdtfl w16du wp14">
+<w:document xmlns:wpc="http://schemas.microsoft.com/office/word/2010/wordprocessingCanvas" xmlns:cx="http://schemas.microsoft.com/office/drawing/2014/chartex" xmlns:cx1="http://schemas.microsoft.com/office/drawing/2015/9/8/chartex" xmlns:cx2="http://schemas.microsoft.com/office/drawing/2015/10/21/chartex" xmlns:cx3="http://schemas.microsoft.com/office/drawing/2016/5/9/chartex" xmlns:cx4="http://schemas.microsoft.com/office/drawing/2016/5/10/chartex" xmlns:cx5="http://schemas.microsoft.com/office/drawing/2016/5/11/chartex" xmlns:cx6="http://schemas.microsoft.com/office/drawing/2016/5/12/chartex" xmlns:cx7="http://schemas.microsoft.com/office/drawing/2016/5/13/chartex" xmlns:cx8="http://schemas.microsoft.com/office/drawing/2016/5/14/chartex" xmlns:mc="http://schemas.openxmlformats.org/markup-compatibility/2006" xmlns:aink="http://schemas.microsoft.com/office/drawing/2016/ink" xmlns:am3d="http://schemas.microsoft.com/office/drawing/2017/model3d" xmlns:o="urn:schemas-microsoft-com:office:office" xmlns:oel="http://schemas.microsoft.com/office/2019/extlst" xmlns:r="http://schemas.openxmlformats.org/officeDocument/2006/relationships" xmlns:m="http://schemas.openxmlformats.org/officeDocument/2006/math" xmlns:v="urn:schemas-microsoft-com:vml" xmlns:wp14="http://schemas.microsoft.com/office/word/2010/wordprocessingDrawing" xmlns:wp="http://schemas.openxmlformats.org/drawingml/2006/wordprocessingDrawing" xmlns:w10="urn:schemas-microsoft-com:office:word" xmlns:w="http://schemas.openxmlformats.org/wordprocessingml/2006/main" xmlns:w14="http://schemas.microsoft.com/office/word/2010/wordml" xmlns:w15="http://schemas.microsoft.com/office/word/2012/wordml" xmlns:w16cei="http://schemas.microsoft.com/office/word/2026/wordml/cei" xmlns:w16cex="http://schemas.microsoft.com/office/word/2018/wordml/cex" xmlns:w16cid="http://schemas.microsoft.com/office/word/2016/wordml/cid" xmlns:w16="http://schemas.microsoft.com/office/word/2018/wordml" xmlns:w16du="http://schemas.microsoft.com/office/word/2023/wordml/word16du" xmlns:w16sdtdh="http://schemas.microsoft.com/office/word/2020/wordml/sdtdatahash" xmlns:w16sdtfl="http://schemas.microsoft.com/office/word/2024/wordml/sdtformatlock" xmlns:w16se="http://schemas.microsoft.com/office/word/2015/wordml/symex" xmlns:wpg="http://schemas.microsoft.com/office/word/2010/wordprocessingGroup" xmlns:wpi="http://schemas.microsoft.com/office/word/2010/wordprocessingInk" xmlns:wne="http://schemas.microsoft.com/office/word/2006/wordml" xmlns:wps="http://schemas.microsoft.com/office/word/2010/wordprocessingShape" mc:Ignorable="w14 w15 w16se w16cid w16 w16cex w16sdtdh w16sdtfl w16du wp14">
   <w:body>
     <w:tbl>
       <w:tblPr>
@@ -815,23 +815,21 @@
                 <w:sz w:val="20"/>
                 <w:szCs w:val="20"/>
               </w:rPr>
-              <w:t xml:space="preserve">A website that details information about Stuart, any technical skills he has, his credentials and resources including links to </w:t>
-            </w:r>
-            <w:proofErr w:type="spellStart"/>
-            <w:r>
-              <w:rPr>
-                <w:sz w:val="20"/>
-                <w:szCs w:val="20"/>
-              </w:rPr>
-              <w:t>Skillbuilder</w:t>
-            </w:r>
-            <w:proofErr w:type="spellEnd"/>
-            <w:r>
-              <w:rPr>
-                <w:sz w:val="20"/>
-                <w:szCs w:val="20"/>
-              </w:rPr>
-              <w:t xml:space="preserve"> profile, AWS Certified Cloud Practitioner Certificate, and CV, and any key projects he has been involved in.</w:t>
+              <w:t>A website that details information about Stuart, any technical skills he has, his credentials and resources including links to Skill</w:t>
+            </w:r>
+            <w:r>
+              <w:rPr>
+                <w:sz w:val="20"/>
+                <w:szCs w:val="20"/>
+              </w:rPr>
+              <w:t xml:space="preserve"> B</w:t>
+            </w:r>
+            <w:r>
+              <w:rPr>
+                <w:sz w:val="20"/>
+                <w:szCs w:val="20"/>
+              </w:rPr>
+              <w:t>uilder profile, AWS Certified Cloud Practitioner Certificate, and CV, and any key projects he has been involved in.</w:t>
             </w:r>
           </w:p>
         </w:tc>
@@ -993,7 +991,7 @@
                 <w:sz w:val="20"/>
                 <w:szCs w:val="20"/>
               </w:rPr>
-              <w:t xml:space="preserve">A static </w:t>
+              <w:t>A static website where the home page shows all the above “What does success look like” details</w:t>
             </w:r>
             <w:r>
               <w:rPr>
@@ -1002,13 +1000,6 @@
               </w:rPr>
               <w:t>.</w:t>
             </w:r>
-            <w:r>
-              <w:rPr>
-                <w:sz w:val="20"/>
-                <w:szCs w:val="20"/>
-              </w:rPr>
-              <w:t>website where the home page shows all the above “What does success look like” details</w:t>
-            </w:r>
           </w:p>
           <w:p>
             <w:pPr>
@@ -1024,6 +1015,13 @@
                 <w:szCs w:val="20"/>
               </w:rPr>
               <w:t>A visitor count and log using DynamoDB</w:t>
+            </w:r>
+            <w:r>
+              <w:rPr>
+                <w:sz w:val="20"/>
+                <w:szCs w:val="20"/>
+              </w:rPr>
+              <w:t>.</w:t>
             </w:r>
           </w:p>
           <w:p>
@@ -1380,11 +1378,6 @@
       </w:tr>
     </w:tbl>
     <w:p/>
-    <w:p>
-      <w:pPr>
-        <w:spacing w:after="120"/>
-      </w:pPr>
-    </w:p>
     <w:tbl>
       <w:tblPr>
         <w:tblW w:w="9773" w:type="dxa"/>
@@ -5600,7 +5593,7 @@
 </file>
 
 <file path=word/numbering.xml><?xml version="1.0" encoding="utf-8"?>
-<w:numbering xmlns:wpc="http://schemas.microsoft.com/office/word/2010/wordprocessingCanvas" xmlns:cx="http://schemas.microsoft.com/office/drawing/2014/chartex" xmlns:cx1="http://schemas.microsoft.com/office/drawing/2015/9/8/chartex" xmlns:cx2="http://schemas.microsoft.com/office/drawing/2015/10/21/chartex" xmlns:cx3="http://schemas.microsoft.com/office/drawing/2016/5/9/chartex" xmlns:cx4="http://schemas.microsoft.com/office/drawing/2016/5/10/chartex" xmlns:cx5="http://schemas.microsoft.com/office/drawing/2016/5/11/chartex" xmlns:cx6="http://schemas.microsoft.com/office/drawing/2016/5/12/chartex" xmlns:cx7="http://schemas.microsoft.com/office/drawing/2016/5/13/chartex" xmlns:cx8="http://schemas.microsoft.com/office/drawing/2016/5/14/chartex" xmlns:mc="http://schemas.openxmlformats.org/markup-compatibility/2006" xmlns:aink="http://schemas.microsoft.com/office/drawing/2016/ink" xmlns:am3d="http://schemas.microsoft.com/office/drawing/2017/model3d" xmlns:o="urn:schemas-microsoft-com:office:office" xmlns:oel="http://schemas.microsoft.com/office/2019/extlst" xmlns:r="http://schemas.openxmlformats.org/officeDocument/2006/relationships" xmlns:m="http://schemas.openxmlformats.org/officeDocument/2006/math" xmlns:v="urn:schemas-microsoft-com:vml" xmlns:wp14="http://schemas.microsoft.com/office/word/2010/wordprocessingDrawing" xmlns:wp="http://schemas.openxmlformats.org/drawingml/2006/wordprocessingDrawing" xmlns:w10="urn:schemas-microsoft-com:office:word" xmlns:w="http://schemas.openxmlformats.org/wordprocessingml/2006/main" xmlns:w14="http://schemas.microsoft.com/office/word/2010/wordml" xmlns:w15="http://schemas.microsoft.com/office/word/2012/wordml" xmlns:w16cex="http://schemas.microsoft.com/office/word/2018/wordml/cex" xmlns:w16cid="http://schemas.microsoft.com/office/word/2016/wordml/cid" xmlns:w16="http://schemas.microsoft.com/office/word/2018/wordml" xmlns:w16du="http://schemas.microsoft.com/office/word/2023/wordml/word16du" xmlns:w16sdtdh="http://schemas.microsoft.com/office/word/2020/wordml/sdtdatahash" xmlns:w16sdtfl="http://schemas.microsoft.com/office/word/2024/wordml/sdtformatlock" xmlns:w16se="http://schemas.microsoft.com/office/word/2015/wordml/symex" xmlns:wpg="http://schemas.microsoft.com/office/word/2010/wordprocessingGroup" xmlns:wpi="http://schemas.microsoft.com/office/word/2010/wordprocessingInk" xmlns:wne="http://schemas.microsoft.com/office/word/2006/wordml" xmlns:wps="http://schemas.microsoft.com/office/word/2010/wordprocessingShape" mc:Ignorable="w14 w15 w16se w16cid w16 w16cex w16sdtdh w16sdtfl w16du wp14">
+<w:numbering xmlns:wpc="http://schemas.microsoft.com/office/word/2010/wordprocessingCanvas" xmlns:cx="http://schemas.microsoft.com/office/drawing/2014/chartex" xmlns:cx1="http://schemas.microsoft.com/office/drawing/2015/9/8/chartex" xmlns:cx2="http://schemas.microsoft.com/office/drawing/2015/10/21/chartex" xmlns:cx3="http://schemas.microsoft.com/office/drawing/2016/5/9/chartex" xmlns:cx4="http://schemas.microsoft.com/office/drawing/2016/5/10/chartex" xmlns:cx5="http://schemas.microsoft.com/office/drawing/2016/5/11/chartex" xmlns:cx6="http://schemas.microsoft.com/office/drawing/2016/5/12/chartex" xmlns:cx7="http://schemas.microsoft.com/office/drawing/2016/5/13/chartex" xmlns:cx8="http://schemas.microsoft.com/office/drawing/2016/5/14/chartex" xmlns:mc="http://schemas.openxmlformats.org/markup-compatibility/2006" xmlns:aink="http://schemas.microsoft.com/office/drawing/2016/ink" xmlns:am3d="http://schemas.microsoft.com/office/drawing/2017/model3d" xmlns:o="urn:schemas-microsoft-com:office:office" xmlns:oel="http://schemas.microsoft.com/office/2019/extlst" xmlns:r="http://schemas.openxmlformats.org/officeDocument/2006/relationships" xmlns:m="http://schemas.openxmlformats.org/officeDocument/2006/math" xmlns:v="urn:schemas-microsoft-com:vml" xmlns:wp14="http://schemas.microsoft.com/office/word/2010/wordprocessingDrawing" xmlns:wp="http://schemas.openxmlformats.org/drawingml/2006/wordprocessingDrawing" xmlns:w10="urn:schemas-microsoft-com:office:word" xmlns:w="http://schemas.openxmlformats.org/wordprocessingml/2006/main" xmlns:w14="http://schemas.microsoft.com/office/word/2010/wordml" xmlns:w15="http://schemas.microsoft.com/office/word/2012/wordml" xmlns:w16cei="http://schemas.microsoft.com/office/word/2026/wordml/cei" xmlns:w16cex="http://schemas.microsoft.com/office/word/2018/wordml/cex" xmlns:w16cid="http://schemas.microsoft.com/office/word/2016/wordml/cid" xmlns:w16="http://schemas.microsoft.com/office/word/2018/wordml" xmlns:w16du="http://schemas.microsoft.com/office/word/2023/wordml/word16du" xmlns:w16sdtdh="http://schemas.microsoft.com/office/word/2020/wordml/sdtdatahash" xmlns:w16sdtfl="http://schemas.microsoft.com/office/word/2024/wordml/sdtformatlock" xmlns:w16se="http://schemas.microsoft.com/office/word/2015/wordml/symex" xmlns:wpg="http://schemas.microsoft.com/office/word/2010/wordprocessingGroup" xmlns:wpi="http://schemas.microsoft.com/office/word/2010/wordprocessingInk" xmlns:wne="http://schemas.microsoft.com/office/word/2006/wordml" xmlns:wps="http://schemas.microsoft.com/office/word/2010/wordprocessingShape" mc:Ignorable="w14 w15 w16se w16cid w16 w16cex w16sdtdh w16sdtfl w16du wp14">
   <w:abstractNum w:abstractNumId="0" w15:restartNumberingAfterBreak="0">
     <w:nsid w:val="11093020"/>
     <w:multiLevelType w:val="hybridMultilevel"/>
@@ -6679,15 +6672,6 @@
 </file>
 
 <file path=customXml/item1.xml><?xml version="1.0" encoding="utf-8"?>
-<?mso-contentType ?>
-<FormTemplates xmlns="http://schemas.microsoft.com/sharepoint/v3/contenttype/forms">
-  <Display>DocumentLibraryForm</Display>
-  <Edit>DocumentLibraryForm</Edit>
-  <New>DocumentLibraryForm</New>
-</FormTemplates>
-</file>
-
-<file path=customXml/item2.xml><?xml version="1.0" encoding="utf-8"?>
 <ct:contentTypeSchema xmlns:ct="http://schemas.microsoft.com/office/2006/metadata/contentType" xmlns:ma="http://schemas.microsoft.com/office/2006/metadata/properties/metaAttributes" ct:_="" ma:_="" ma:contentTypeName="Document" ma:contentTypeID="0x010100A81AF59A993C62428A8621167C157F34" ma:contentTypeVersion="13" ma:contentTypeDescription="Create a new document." ma:contentTypeScope="" ma:versionID="075165b7e1cb8af8b703c101e4eb52cd">
   <xsd:schema xmlns:xsd="http://www.w3.org/2001/XMLSchema" xmlns:xs="http://www.w3.org/2001/XMLSchema" xmlns:p="http://schemas.microsoft.com/office/2006/metadata/properties" xmlns:ns2="833209ff-be3b-48c0-8c17-04759cd24c23" xmlns:ns3="1f02373c-91b9-4d50-88b3-64e98dbf38be" targetNamespace="http://schemas.microsoft.com/office/2006/metadata/properties" ma:root="true" ma:fieldsID="2de1db6c7938850308e1daad5469f5c7" ns2:_="" ns3:_="">
     <xsd:import namespace="833209ff-be3b-48c0-8c17-04759cd24c23"/>
@@ -6894,7 +6878,7 @@
 </ct:contentTypeSchema>
 </file>
 
-<file path=customXml/item3.xml><?xml version="1.0" encoding="utf-8"?>
+<file path=customXml/item2.xml><?xml version="1.0" encoding="utf-8"?>
 <p:properties xmlns:p="http://schemas.microsoft.com/office/2006/metadata/properties" xmlns:xsi="http://www.w3.org/2001/XMLSchema-instance" xmlns:pc="http://schemas.microsoft.com/office/infopath/2007/PartnerControls">
   <documentManagement>
     <TaxCatchAll xmlns="1f02373c-91b9-4d50-88b3-64e98dbf38be" xsi:nil="true"/>
@@ -6905,15 +6889,16 @@
 </p:properties>
 </file>
 
-<file path=customXml/itemProps1.xml><?xml version="1.0" encoding="utf-8"?>
-<ds:datastoreItem xmlns:ds="http://schemas.openxmlformats.org/officeDocument/2006/customXml" ds:itemID="{CE4BE2F9-5067-4088-9F9B-1F3D17ABA8D7}">
-  <ds:schemaRefs>
-    <ds:schemaRef ds:uri="http://schemas.microsoft.com/sharepoint/v3/contenttype/forms"/>
-  </ds:schemaRefs>
-</ds:datastoreItem>
+<file path=customXml/item3.xml><?xml version="1.0" encoding="utf-8"?>
+<?mso-contentType ?>
+<FormTemplates xmlns="http://schemas.microsoft.com/sharepoint/v3/contenttype/forms">
+  <Display>DocumentLibraryForm</Display>
+  <Edit>DocumentLibraryForm</Edit>
+  <New>DocumentLibraryForm</New>
+</FormTemplates>
 </file>
 
-<file path=customXml/itemProps2.xml><?xml version="1.0" encoding="utf-8"?>
+<file path=customXml/itemProps1.xml><?xml version="1.0" encoding="utf-8"?>
 <ds:datastoreItem xmlns:ds="http://schemas.openxmlformats.org/officeDocument/2006/customXml" ds:itemID="{9A75C942-B85E-4058-9186-0955E3756449}">
   <ds:schemaRefs>
     <ds:schemaRef ds:uri="http://schemas.microsoft.com/office/2006/metadata/contentType"/>
@@ -6932,7 +6917,7 @@
 </ds:datastoreItem>
 </file>
 
-<file path=customXml/itemProps3.xml><?xml version="1.0" encoding="utf-8"?>
+<file path=customXml/itemProps2.xml><?xml version="1.0" encoding="utf-8"?>
 <ds:datastoreItem xmlns:ds="http://schemas.openxmlformats.org/officeDocument/2006/customXml" ds:itemID="{82E5BD80-5074-4316-B334-2041375E4FBF}">
   <ds:schemaRefs>
     <ds:schemaRef ds:uri="http://schemas.microsoft.com/office/2006/metadata/properties"/>
@@ -6941,4 +6926,12 @@
     <ds:schemaRef ds:uri="833209ff-be3b-48c0-8c17-04759cd24c23"/>
   </ds:schemaRefs>
 </ds:datastoreItem>
+</file>
+
+<file path=customXml/itemProps3.xml><?xml version="1.0" encoding="utf-8"?>
+<ds:datastoreItem xmlns:ds="http://schemas.openxmlformats.org/officeDocument/2006/customXml" ds:itemID="{CE4BE2F9-5067-4088-9F9B-1F3D17ABA8D7}">
+  <ds:schemaRefs>
+    <ds:schemaRef ds:uri="http://schemas.microsoft.com/sharepoint/v3/contenttype/forms"/>
+  </ds:schemaRefs>
+</ds:datastoreItem>
 </file>
</xml_diff>